<commit_message>
Rename NotebookLM to Gemini Notebook across the course
Google's NotebookLM has been rebranded Gemini Notebook. All current-tool
references across the slide decks, quiz bank, labs, glossary, data,
fluency export and the Word documents (Removes slide content + five
lesson-plan packs) now use the new name — 145 renames in total.

Kept deliberately historical: the 2024 "NotebookLM Goes Viral" timeline
entry (with a rebrand note appended) and the two launch-blog source
labels, since those describe the product as it was named at the time.
The glossary entry reads "Gemini Notebook (formerly NotebookLM)" so
pupils recognise the old name.

Co-Authored-By: Claude Fable 5 <noreply@anthropic.com>
Claude-Session: https://claude.ai/code/session_01F3Xho7fBUG4TDUuwQVvC3N
</commit_message>
<xml_diff>
--- a/Lesson Plans/Digital_Innovation_Lesson_Plans_Week3.docx
+++ b/Lesson Plans/Digital_Innovation_Lesson_Plans_Week3.docx
@@ -1475,7 +1475,7 @@
         <w:spacing w:after="40"/>
       </w:pPr>
       <w:r>
-        <w:t xml:space="preserve">Conduct deep research using AI synthesis tools (NotebookLM)</w:t>
+        <w:t xml:space="preserve">Conduct deep research using AI synthesis tools (Gemini Notebook)</w:t>
       </w:r>
     </w:p>
     <w:p>
@@ -1545,7 +1545,7 @@
         <w:spacing w:after="40"/>
       </w:pPr>
       <w:r>
-        <w:t xml:space="preserve">NotebookLM (free Google tool)</w:t>
+        <w:t xml:space="preserve">Gemini Notebook (free Google tool)</w:t>
       </w:r>
     </w:p>
     <w:p>
@@ -1737,33 +1737,33 @@
         <w:spacing w:after="40"/>
       </w:pPr>
       <w:r>
-        <w:t xml:space="preserve">Deep Research Protocol using NotebookLM:</w:t>
-      </w:r>
-    </w:p>
-    <w:p>
-      <w:pPr>
-        <w:pStyle w:val="ListParagraph"/>
-        <w:numPr>
-          <w:ilvl w:val="0"/>
-          <w:numId w:val="1"/>
-        </w:numPr>
-        <w:spacing w:after="40"/>
-      </w:pPr>
-      <w:r>
-        <w:t xml:space="preserve">  1. Upload all 3 reports into NotebookLM</w:t>
-      </w:r>
-    </w:p>
-    <w:p>
-      <w:pPr>
-        <w:pStyle w:val="ListParagraph"/>
-        <w:numPr>
-          <w:ilvl w:val="0"/>
-          <w:numId w:val="1"/>
-        </w:numPr>
-        <w:spacing w:after="40"/>
-      </w:pPr>
-      <w:r>
-        <w:t xml:space="preserve">  2. Ask NotebookLM to synthesise: "What does AI job displacement mean for [their degree]?"</w:t>
+        <w:t xml:space="preserve">Deep Research Protocol using Gemini Notebook:</w:t>
+      </w:r>
+    </w:p>
+    <w:p>
+      <w:pPr>
+        <w:pStyle w:val="ListParagraph"/>
+        <w:numPr>
+          <w:ilvl w:val="0"/>
+          <w:numId w:val="1"/>
+        </w:numPr>
+        <w:spacing w:after="40"/>
+      </w:pPr>
+      <w:r>
+        <w:t xml:space="preserve">  1. Upload all 3 reports into Gemini Notebook</w:t>
+      </w:r>
+    </w:p>
+    <w:p>
+      <w:pPr>
+        <w:pStyle w:val="ListParagraph"/>
+        <w:numPr>
+          <w:ilvl w:val="0"/>
+          <w:numId w:val="1"/>
+        </w:numPr>
+        <w:spacing w:after="40"/>
+      </w:pPr>
+      <w:r>
+        <w:t xml:space="preserve">  2. Ask Gemini Notebook to synthesise: "What does AI job displacement mean for [their degree]?"</w:t>
       </w:r>
     </w:p>
     <w:p>
@@ -2094,7 +2094,7 @@
         <w:spacing w:after="40"/>
       </w:pPr>
       <w:r>
-        <w:t xml:space="preserve">Guide them to ask NotebookLM more concrete questions (vs. open-ended)</w:t>
+        <w:t xml:space="preserve">Guide them to ask Gemini Notebook more concrete questions (vs. open-ended)</w:t>
       </w:r>
     </w:p>
     <w:p>
@@ -2142,7 +2142,7 @@
         <w:spacing w:after="40"/>
       </w:pPr>
       <w:r>
-        <w:t xml:space="preserve">NotebookLM Synthesis: Screenshot and annotated excerpt from the AI synthesis</w:t>
+        <w:t xml:space="preserve">Gemini Notebook Synthesis: Screenshot and annotated excerpt from the AI synthesis</w:t>
       </w:r>
     </w:p>
     <w:p>

</xml_diff>